<commit_message>
Tarea 5 - Update
</commit_message>
<xml_diff>
--- a/Tarea 5/PLC4UNI Manual Edicion 1.0.docx
+++ b/Tarea 5/PLC4UNI Manual Edicion 1.0.docx
@@ -127,6 +127,14 @@
     </w:p>
     <w:sdt>
       <w:sdtPr>
+        <w:rPr>
+          <w:rFonts w:asciiTheme="minorHAnsi" w:eastAsiaTheme="minorHAnsi" w:hAnsiTheme="minorHAnsi" w:cstheme="minorBidi"/>
+          <w:color w:val="auto"/>
+          <w:kern w:val="2"/>
+          <w:sz w:val="24"/>
+          <w:szCs w:val="24"/>
+          <w14:ligatures w14:val="standardContextual"/>
+        </w:rPr>
         <w:id w:val="-1987301231"/>
         <w:docPartObj>
           <w:docPartGallery w:val="Table of Contents"/>
@@ -135,15 +143,9 @@
       </w:sdtPr>
       <w:sdtEndPr>
         <w:rPr>
-          <w:rFonts w:asciiTheme="minorHAnsi" w:eastAsiaTheme="minorHAnsi" w:hAnsiTheme="minorHAnsi" w:cstheme="minorBidi"/>
           <w:b/>
           <w:bCs/>
           <w:noProof/>
-          <w:color w:val="auto"/>
-          <w:kern w:val="2"/>
-          <w:sz w:val="24"/>
-          <w:szCs w:val="24"/>
-          <w14:ligatures w14:val="standardContextual"/>
         </w:rPr>
       </w:sdtEndPr>
       <w:sdtContent>
@@ -193,7 +195,7 @@
           <w:r>
             <w:fldChar w:fldCharType="separate"/>
           </w:r>
-          <w:hyperlink w:anchor="_Toc216305364" w:history="1">
+          <w:hyperlink w:anchor="_Toc216388707" w:history="1">
             <w:r>
               <w:rPr>
                 <w:rStyle w:val="Hyperlink"/>
@@ -224,7 +226,7 @@
                 <w:noProof/>
                 <w:webHidden/>
               </w:rPr>
-              <w:instrText xml:space="preserve"> PAGEREF _Toc216305364 \h </w:instrText>
+              <w:instrText xml:space="preserve"> PAGEREF _Toc216388707 \h </w:instrText>
             </w:r>
             <w:r>
               <w:rPr>
@@ -270,7 +272,7 @@
               <w14:ligatures w14:val="standardContextual"/>
             </w:rPr>
           </w:pPr>
-          <w:hyperlink w:anchor="_Toc216305365" w:history="1">
+          <w:hyperlink w:anchor="_Toc216388708" w:history="1">
             <w:r>
               <w:rPr>
                 <w:rStyle w:val="Hyperlink"/>
@@ -301,7 +303,7 @@
                 <w:noProof/>
                 <w:webHidden/>
               </w:rPr>
-              <w:instrText xml:space="preserve"> PAGEREF _Toc216305365 \h </w:instrText>
+              <w:instrText xml:space="preserve"> PAGEREF _Toc216388708 \h </w:instrText>
             </w:r>
             <w:r>
               <w:rPr>
@@ -347,7 +349,7 @@
               <w14:ligatures w14:val="standardContextual"/>
             </w:rPr>
           </w:pPr>
-          <w:hyperlink w:anchor="_Toc216305366" w:history="1">
+          <w:hyperlink w:anchor="_Toc216388709" w:history="1">
             <w:r>
               <w:rPr>
                 <w:rStyle w:val="Hyperlink"/>
@@ -378,7 +380,7 @@
                 <w:noProof/>
                 <w:webHidden/>
               </w:rPr>
-              <w:instrText xml:space="preserve"> PAGEREF _Toc216305366 \h </w:instrText>
+              <w:instrText xml:space="preserve"> PAGEREF _Toc216388709 \h </w:instrText>
             </w:r>
             <w:r>
               <w:rPr>
@@ -424,7 +426,7 @@
               <w14:ligatures w14:val="standardContextual"/>
             </w:rPr>
           </w:pPr>
-          <w:hyperlink w:anchor="_Toc216305367" w:history="1">
+          <w:hyperlink w:anchor="_Toc216388710" w:history="1">
             <w:r>
               <w:rPr>
                 <w:rStyle w:val="Hyperlink"/>
@@ -455,7 +457,7 @@
                 <w:noProof/>
                 <w:webHidden/>
               </w:rPr>
-              <w:instrText xml:space="preserve"> PAGEREF _Toc216305367 \h </w:instrText>
+              <w:instrText xml:space="preserve"> PAGEREF _Toc216388710 \h </w:instrText>
             </w:r>
             <w:r>
               <w:rPr>
@@ -501,7 +503,7 @@
               <w14:ligatures w14:val="standardContextual"/>
             </w:rPr>
           </w:pPr>
-          <w:hyperlink w:anchor="_Toc216305368" w:history="1">
+          <w:hyperlink w:anchor="_Toc216388711" w:history="1">
             <w:r>
               <w:rPr>
                 <w:rStyle w:val="Hyperlink"/>
@@ -532,7 +534,7 @@
                 <w:noProof/>
                 <w:webHidden/>
               </w:rPr>
-              <w:instrText xml:space="preserve"> PAGEREF _Toc216305368 \h </w:instrText>
+              <w:instrText xml:space="preserve"> PAGEREF _Toc216388711 \h </w:instrText>
             </w:r>
             <w:r>
               <w:rPr>
@@ -578,7 +580,7 @@
               <w14:ligatures w14:val="standardContextual"/>
             </w:rPr>
           </w:pPr>
-          <w:hyperlink w:anchor="_Toc216305369" w:history="1">
+          <w:hyperlink w:anchor="_Toc216388712" w:history="1">
             <w:r>
               <w:rPr>
                 <w:rStyle w:val="Hyperlink"/>
@@ -609,7 +611,7 @@
                 <w:noProof/>
                 <w:webHidden/>
               </w:rPr>
-              <w:instrText xml:space="preserve"> PAGEREF _Toc216305369 \h </w:instrText>
+              <w:instrText xml:space="preserve"> PAGEREF _Toc216388712 \h </w:instrText>
             </w:r>
             <w:r>
               <w:rPr>
@@ -655,7 +657,7 @@
               <w14:ligatures w14:val="standardContextual"/>
             </w:rPr>
           </w:pPr>
-          <w:hyperlink w:anchor="_Toc216305370" w:history="1">
+          <w:hyperlink w:anchor="_Toc216388713" w:history="1">
             <w:r>
               <w:rPr>
                 <w:rStyle w:val="Hyperlink"/>
@@ -686,7 +688,7 @@
                 <w:noProof/>
                 <w:webHidden/>
               </w:rPr>
-              <w:instrText xml:space="preserve"> PAGEREF _Toc216305370 \h </w:instrText>
+              <w:instrText xml:space="preserve"> PAGEREF _Toc216388713 \h </w:instrText>
             </w:r>
             <w:r>
               <w:rPr>
@@ -732,7 +734,7 @@
               <w14:ligatures w14:val="standardContextual"/>
             </w:rPr>
           </w:pPr>
-          <w:hyperlink w:anchor="_Toc216305371" w:history="1">
+          <w:hyperlink w:anchor="_Toc216388714" w:history="1">
             <w:r>
               <w:rPr>
                 <w:rStyle w:val="Hyperlink"/>
@@ -763,7 +765,7 @@
                 <w:noProof/>
                 <w:webHidden/>
               </w:rPr>
-              <w:instrText xml:space="preserve"> PAGEREF _Toc216305371 \h </w:instrText>
+              <w:instrText xml:space="preserve"> PAGEREF _Toc216388714 \h </w:instrText>
             </w:r>
             <w:r>
               <w:rPr>
@@ -809,7 +811,7 @@
               <w14:ligatures w14:val="standardContextual"/>
             </w:rPr>
           </w:pPr>
-          <w:hyperlink w:anchor="_Toc216305372" w:history="1">
+          <w:hyperlink w:anchor="_Toc216388715" w:history="1">
             <w:r>
               <w:rPr>
                 <w:rStyle w:val="Hyperlink"/>
@@ -840,7 +842,7 @@
                 <w:noProof/>
                 <w:webHidden/>
               </w:rPr>
-              <w:instrText xml:space="preserve"> PAGEREF _Toc216305372 \h </w:instrText>
+              <w:instrText xml:space="preserve"> PAGEREF _Toc216388715 \h </w:instrText>
             </w:r>
             <w:r>
               <w:rPr>
@@ -886,7 +888,7 @@
               <w14:ligatures w14:val="standardContextual"/>
             </w:rPr>
           </w:pPr>
-          <w:hyperlink w:anchor="_Toc216305373" w:history="1">
+          <w:hyperlink w:anchor="_Toc216388716" w:history="1">
             <w:r>
               <w:rPr>
                 <w:rStyle w:val="Hyperlink"/>
@@ -917,7 +919,7 @@
                 <w:noProof/>
                 <w:webHidden/>
               </w:rPr>
-              <w:instrText xml:space="preserve"> PAGEREF _Toc216305373 \h </w:instrText>
+              <w:instrText xml:space="preserve"> PAGEREF _Toc216388716 \h </w:instrText>
             </w:r>
             <w:r>
               <w:rPr>
@@ -963,7 +965,7 @@
               <w14:ligatures w14:val="standardContextual"/>
             </w:rPr>
           </w:pPr>
-          <w:hyperlink w:anchor="_Toc216305374" w:history="1">
+          <w:hyperlink w:anchor="_Toc216388717" w:history="1">
             <w:r>
               <w:rPr>
                 <w:rStyle w:val="Hyperlink"/>
@@ -994,7 +996,7 @@
                 <w:noProof/>
                 <w:webHidden/>
               </w:rPr>
-              <w:instrText xml:space="preserve"> PAGEREF _Toc216305374 \h </w:instrText>
+              <w:instrText xml:space="preserve"> PAGEREF _Toc216388717 \h </w:instrText>
             </w:r>
             <w:r>
               <w:rPr>
@@ -1040,7 +1042,7 @@
               <w14:ligatures w14:val="standardContextual"/>
             </w:rPr>
           </w:pPr>
-          <w:hyperlink w:anchor="_Toc216305375" w:history="1">
+          <w:hyperlink w:anchor="_Toc216388718" w:history="1">
             <w:r>
               <w:rPr>
                 <w:rStyle w:val="Hyperlink"/>
@@ -1070,7 +1072,7 @@
                 <w:noProof/>
                 <w:webHidden/>
               </w:rPr>
-              <w:instrText xml:space="preserve"> PAGEREF _Toc216305375 \h </w:instrText>
+              <w:instrText xml:space="preserve"> PAGEREF _Toc216388718 \h </w:instrText>
             </w:r>
             <w:r>
               <w:rPr>
@@ -1116,7 +1118,7 @@
               <w14:ligatures w14:val="standardContextual"/>
             </w:rPr>
           </w:pPr>
-          <w:hyperlink w:anchor="_Toc216305376" w:history="1">
+          <w:hyperlink w:anchor="_Toc216388719" w:history="1">
             <w:r>
               <w:rPr>
                 <w:rStyle w:val="Hyperlink"/>
@@ -1146,7 +1148,7 @@
                 <w:noProof/>
                 <w:webHidden/>
               </w:rPr>
-              <w:instrText xml:space="preserve"> PAGEREF _Toc216305376 \h </w:instrText>
+              <w:instrText xml:space="preserve"> PAGEREF _Toc216388719 \h </w:instrText>
             </w:r>
             <w:r>
               <w:rPr>
@@ -1192,7 +1194,7 @@
               <w14:ligatures w14:val="standardContextual"/>
             </w:rPr>
           </w:pPr>
-          <w:hyperlink w:anchor="_Toc216305377" w:history="1">
+          <w:hyperlink w:anchor="_Toc216388720" w:history="1">
             <w:r>
               <w:rPr>
                 <w:rStyle w:val="Hyperlink"/>
@@ -1233,7 +1235,7 @@
                 <w:noProof/>
                 <w:webHidden/>
               </w:rPr>
-              <w:instrText xml:space="preserve"> PAGEREF _Toc216305377 \h </w:instrText>
+              <w:instrText xml:space="preserve"> PAGEREF _Toc216388720 \h </w:instrText>
             </w:r>
             <w:r>
               <w:rPr>
@@ -1279,7 +1281,7 @@
               <w14:ligatures w14:val="standardContextual"/>
             </w:rPr>
           </w:pPr>
-          <w:hyperlink w:anchor="_Toc216305378" w:history="1">
+          <w:hyperlink w:anchor="_Toc216388721" w:history="1">
             <w:r>
               <w:rPr>
                 <w:rStyle w:val="Hyperlink"/>
@@ -1310,7 +1312,7 @@
                 <w:noProof/>
                 <w:webHidden/>
               </w:rPr>
-              <w:instrText xml:space="preserve"> PAGEREF _Toc216305378 \h </w:instrText>
+              <w:instrText xml:space="preserve"> PAGEREF _Toc216388721 \h </w:instrText>
             </w:r>
             <w:r>
               <w:rPr>
@@ -1331,6 +1333,160 @@
                 <w:webHidden/>
               </w:rPr>
               <w:t>7</w:t>
+            </w:r>
+            <w:r>
+              <w:rPr>
+                <w:noProof/>
+                <w:webHidden/>
+              </w:rPr>
+              <w:fldChar w:fldCharType="end"/>
+            </w:r>
+          </w:hyperlink>
+        </w:p>
+        <w:p>
+          <w:pPr>
+            <w:pStyle w:val="TOC1"/>
+            <w:tabs>
+              <w:tab w:val="right" w:leader="dot" w:pos="9350"/>
+            </w:tabs>
+            <w:rPr>
+              <w:rFonts w:cstheme="minorBidi"/>
+              <w:noProof/>
+              <w:kern w:val="2"/>
+              <w:sz w:val="24"/>
+              <w:szCs w:val="24"/>
+              <w14:ligatures w14:val="standardContextual"/>
+            </w:rPr>
+          </w:pPr>
+          <w:hyperlink w:anchor="_Toc216388722" w:history="1">
+            <w:r>
+              <w:rPr>
+                <w:rStyle w:val="Hyperlink"/>
+                <w:rFonts w:ascii="Times New Roman" w:hAnsi="Times New Roman"/>
+                <w:b/>
+                <w:bCs/>
+                <w:noProof/>
+                <w:lang w:val="es-DO"/>
+              </w:rPr>
+              <w:t>Mantenimiento básico</w:t>
+            </w:r>
+            <w:r>
+              <w:rPr>
+                <w:noProof/>
+                <w:webHidden/>
+              </w:rPr>
+              <w:tab/>
+            </w:r>
+            <w:r>
+              <w:rPr>
+                <w:noProof/>
+                <w:webHidden/>
+              </w:rPr>
+              <w:fldChar w:fldCharType="begin"/>
+            </w:r>
+            <w:r>
+              <w:rPr>
+                <w:noProof/>
+                <w:webHidden/>
+              </w:rPr>
+              <w:instrText xml:space="preserve"> PAGEREF _Toc216388722 \h </w:instrText>
+            </w:r>
+            <w:r>
+              <w:rPr>
+                <w:noProof/>
+                <w:webHidden/>
+              </w:rPr>
+            </w:r>
+            <w:r>
+              <w:rPr>
+                <w:noProof/>
+                <w:webHidden/>
+              </w:rPr>
+              <w:fldChar w:fldCharType="separate"/>
+            </w:r>
+            <w:r>
+              <w:rPr>
+                <w:noProof/>
+                <w:webHidden/>
+              </w:rPr>
+              <w:t>8</w:t>
+            </w:r>
+            <w:r>
+              <w:rPr>
+                <w:noProof/>
+                <w:webHidden/>
+              </w:rPr>
+              <w:fldChar w:fldCharType="end"/>
+            </w:r>
+          </w:hyperlink>
+        </w:p>
+        <w:p>
+          <w:pPr>
+            <w:pStyle w:val="TOC1"/>
+            <w:tabs>
+              <w:tab w:val="right" w:leader="dot" w:pos="9350"/>
+            </w:tabs>
+            <w:rPr>
+              <w:rFonts w:cstheme="minorBidi"/>
+              <w:noProof/>
+              <w:kern w:val="2"/>
+              <w:sz w:val="24"/>
+              <w:szCs w:val="24"/>
+              <w14:ligatures w14:val="standardContextual"/>
+            </w:rPr>
+          </w:pPr>
+          <w:hyperlink w:anchor="_Toc216388723" w:history="1">
+            <w:r>
+              <w:rPr>
+                <w:rStyle w:val="Hyperlink"/>
+                <w:rFonts w:ascii="Times New Roman" w:hAnsi="Times New Roman"/>
+                <w:b/>
+                <w:bCs/>
+                <w:noProof/>
+                <w:lang w:val="es-DO"/>
+              </w:rPr>
+              <w:t>Bibliografías</w:t>
+            </w:r>
+            <w:r>
+              <w:rPr>
+                <w:noProof/>
+                <w:webHidden/>
+              </w:rPr>
+              <w:tab/>
+            </w:r>
+            <w:r>
+              <w:rPr>
+                <w:noProof/>
+                <w:webHidden/>
+              </w:rPr>
+              <w:fldChar w:fldCharType="begin"/>
+            </w:r>
+            <w:r>
+              <w:rPr>
+                <w:noProof/>
+                <w:webHidden/>
+              </w:rPr>
+              <w:instrText xml:space="preserve"> PAGEREF _Toc216388723 \h </w:instrText>
+            </w:r>
+            <w:r>
+              <w:rPr>
+                <w:noProof/>
+                <w:webHidden/>
+              </w:rPr>
+            </w:r>
+            <w:r>
+              <w:rPr>
+                <w:noProof/>
+                <w:webHidden/>
+              </w:rPr>
+              <w:fldChar w:fldCharType="separate"/>
+            </w:r>
+            <w:r>
+              <w:rPr>
+                <w:noProof/>
+                <w:webHidden/>
+              </w:rPr>
+              <w:t>8</w:t>
             </w:r>
             <w:r>
               <w:rPr>
@@ -1466,7 +1622,7 @@
           <w:lang w:val="es-DO"/>
         </w:rPr>
       </w:pPr>
-      <w:bookmarkStart w:id="0" w:name="_Toc216305364"/>
+      <w:bookmarkStart w:id="0" w:name="_Toc216388707"/>
       <w:r>
         <w:rPr>
           <w:rFonts w:ascii="Times New Roman" w:hAnsi="Times New Roman" w:cs="Times New Roman"/>
@@ -1475,7 +1631,6 @@
           <w:color w:val="000000" w:themeColor="text1"/>
           <w:lang w:val="es-DO"/>
         </w:rPr>
-        <w:lastRenderedPageBreak/>
         <w:t>Introducción</w:t>
       </w:r>
       <w:bookmarkEnd w:id="0"/>
@@ -1491,7 +1646,7 @@
           <w:lang w:val="es-DO"/>
         </w:rPr>
       </w:pPr>
-      <w:bookmarkStart w:id="1" w:name="_Toc216305365"/>
+      <w:bookmarkStart w:id="1" w:name="_Toc216388708"/>
       <w:r>
         <w:rPr>
           <w:rFonts w:ascii="Times New Roman" w:hAnsi="Times New Roman" w:cs="Times New Roman"/>
@@ -1795,7 +1950,7 @@
           <w:lang w:val="es-DO"/>
         </w:rPr>
       </w:pPr>
-      <w:bookmarkStart w:id="2" w:name="_Toc216305366"/>
+      <w:bookmarkStart w:id="2" w:name="_Toc216388709"/>
       <w:proofErr w:type="spellStart"/>
       <w:r>
         <w:rPr>
@@ -1851,7 +2006,7 @@
           <w:lang w:val="es-DO"/>
         </w:rPr>
       </w:pPr>
-      <w:bookmarkStart w:id="3" w:name="_Toc216305367"/>
+      <w:bookmarkStart w:id="3" w:name="_Toc216388710"/>
       <w:r>
         <w:rPr>
           <w:rFonts w:ascii="Times New Roman" w:hAnsi="Times New Roman" w:cs="Times New Roman"/>
@@ -2061,6 +2216,7 @@
           <w:bCs/>
           <w:sz w:val="28"/>
           <w:szCs w:val="28"/>
+          <w:lang w:val="es-DO"/>
         </w:rPr>
         <w:t>PCB:</w:t>
       </w:r>
@@ -2069,8 +2225,69 @@
           <w:rFonts w:ascii="Times New Roman" w:hAnsi="Times New Roman" w:cs="Times New Roman"/>
           <w:sz w:val="28"/>
           <w:szCs w:val="28"/>
-        </w:rPr>
-        <w:t xml:space="preserve"> (Printed Circuit Board). </w:t>
+          <w:lang w:val="es-DO"/>
+        </w:rPr>
+        <w:t xml:space="preserve"> (</w:t>
+      </w:r>
+      <w:proofErr w:type="spellStart"/>
+      <w:r>
+        <w:rPr>
+          <w:rFonts w:ascii="Times New Roman" w:hAnsi="Times New Roman" w:cs="Times New Roman"/>
+          <w:sz w:val="28"/>
+          <w:szCs w:val="28"/>
+          <w:lang w:val="es-DO"/>
+        </w:rPr>
+        <w:t>Printed</w:t>
+      </w:r>
+      <w:proofErr w:type="spellEnd"/>
+      <w:r>
+        <w:rPr>
+          <w:rFonts w:ascii="Times New Roman" w:hAnsi="Times New Roman" w:cs="Times New Roman"/>
+          <w:sz w:val="28"/>
+          <w:szCs w:val="28"/>
+          <w:lang w:val="es-DO"/>
+        </w:rPr>
+        <w:t xml:space="preserve"> </w:t>
+      </w:r>
+      <w:proofErr w:type="spellStart"/>
+      <w:r>
+        <w:rPr>
+          <w:rFonts w:ascii="Times New Roman" w:hAnsi="Times New Roman" w:cs="Times New Roman"/>
+          <w:sz w:val="28"/>
+          <w:szCs w:val="28"/>
+          <w:lang w:val="es-DO"/>
+        </w:rPr>
+        <w:t>Circuit</w:t>
+      </w:r>
+      <w:proofErr w:type="spellEnd"/>
+      <w:r>
+        <w:rPr>
+          <w:rFonts w:ascii="Times New Roman" w:hAnsi="Times New Roman" w:cs="Times New Roman"/>
+          <w:sz w:val="28"/>
+          <w:szCs w:val="28"/>
+          <w:lang w:val="es-DO"/>
+        </w:rPr>
+        <w:t xml:space="preserve"> </w:t>
+      </w:r>
+      <w:proofErr w:type="spellStart"/>
+      <w:r>
+        <w:rPr>
+          <w:rFonts w:ascii="Times New Roman" w:hAnsi="Times New Roman" w:cs="Times New Roman"/>
+          <w:sz w:val="28"/>
+          <w:szCs w:val="28"/>
+          <w:lang w:val="es-DO"/>
+        </w:rPr>
+        <w:t>Board</w:t>
+      </w:r>
+      <w:proofErr w:type="spellEnd"/>
+      <w:r>
+        <w:rPr>
+          <w:rFonts w:ascii="Times New Roman" w:hAnsi="Times New Roman" w:cs="Times New Roman"/>
+          <w:sz w:val="28"/>
+          <w:szCs w:val="28"/>
+          <w:lang w:val="es-DO"/>
+        </w:rPr>
+        <w:t xml:space="preserve">). </w:t>
       </w:r>
       <w:r>
         <w:rPr>
@@ -2079,7 +2296,17 @@
           <w:szCs w:val="28"/>
           <w:lang w:val="es-ES"/>
         </w:rPr>
-        <w:t>Es una placa plana hecha de material aislante con pistas de material conductor en la superficie, mayormente de cobre. Esta placa se conoce como la base mediante la cual se conectan y se montan los componentes electrónicos.</w:t>
+        <w:t xml:space="preserve">Es una placa plana hecha de material aislante con pistas de material conductor en la superficie, mayormente de cobre. Esta </w:t>
+      </w:r>
+      <w:r>
+        <w:rPr>
+          <w:rFonts w:ascii="Times New Roman" w:hAnsi="Times New Roman" w:cs="Times New Roman"/>
+          <w:sz w:val="28"/>
+          <w:szCs w:val="28"/>
+          <w:lang w:val="es-ES"/>
+        </w:rPr>
+        <w:lastRenderedPageBreak/>
+        <w:t>placa se conoce como la base mediante la cual se conectan y se montan los componentes electrónicos.</w:t>
       </w:r>
     </w:p>
     <w:p>
@@ -2104,7 +2331,6 @@
           <w:szCs w:val="28"/>
           <w:lang w:val="es-DO"/>
         </w:rPr>
-        <w:lastRenderedPageBreak/>
         <w:t xml:space="preserve">CPU: </w:t>
       </w:r>
       <w:r>
@@ -2342,7 +2568,7 @@
           <w:lang w:val="es-DO"/>
         </w:rPr>
       </w:pPr>
-      <w:bookmarkStart w:id="4" w:name="_Toc216305368"/>
+      <w:bookmarkStart w:id="4" w:name="_Toc216388711"/>
       <w:r>
         <w:rPr>
           <w:rFonts w:ascii="Times New Roman" w:hAnsi="Times New Roman" w:cs="Times New Roman"/>
@@ -2387,7 +2613,7 @@
           <w:lang w:val="es-DO"/>
         </w:rPr>
       </w:pPr>
-      <w:bookmarkStart w:id="5" w:name="_Toc216305369"/>
+      <w:bookmarkStart w:id="5" w:name="_Toc216388712"/>
       <w:r>
         <w:rPr>
           <w:rFonts w:ascii="Times New Roman" w:hAnsi="Times New Roman" w:cs="Times New Roman"/>
@@ -2633,7 +2859,7 @@
           <w:lang w:val="es-DO"/>
         </w:rPr>
       </w:pPr>
-      <w:bookmarkStart w:id="6" w:name="_Toc216305370"/>
+      <w:bookmarkStart w:id="6" w:name="_Toc216388713"/>
       <w:r>
         <w:rPr>
           <w:rFonts w:ascii="Times New Roman" w:hAnsi="Times New Roman" w:cs="Times New Roman"/>
@@ -2665,7 +2891,7 @@
           <w:lang w:val="es-DO"/>
         </w:rPr>
       </w:pPr>
-      <w:bookmarkStart w:id="7" w:name="_Toc216305371"/>
+      <w:bookmarkStart w:id="7" w:name="_Toc216388714"/>
       <w:r>
         <w:rPr>
           <w:rFonts w:ascii="Times New Roman" w:hAnsi="Times New Roman" w:cs="Times New Roman"/>
@@ -2871,7 +3097,7 @@
           <w:lang w:val="es-DO"/>
         </w:rPr>
       </w:pPr>
-      <w:bookmarkStart w:id="8" w:name="_Toc216305372"/>
+      <w:bookmarkStart w:id="8" w:name="_Toc216388715"/>
       <w:r>
         <w:rPr>
           <w:rFonts w:ascii="Times New Roman" w:hAnsi="Times New Roman" w:cs="Times New Roman"/>
@@ -3230,7 +3456,7 @@
         <w:lastRenderedPageBreak/>
         <w:tab/>
       </w:r>
-      <w:bookmarkStart w:id="9" w:name="_Toc216305373"/>
+      <w:bookmarkStart w:id="9" w:name="_Toc216388716"/>
       <w:r>
         <w:rPr>
           <w:rFonts w:ascii="Times New Roman" w:hAnsi="Times New Roman" w:cs="Times New Roman"/>
@@ -3253,7 +3479,7 @@
           <w:lang w:val="es-DO"/>
         </w:rPr>
       </w:pPr>
-      <w:bookmarkStart w:id="10" w:name="_Toc216305374"/>
+      <w:bookmarkStart w:id="10" w:name="_Toc216388717"/>
       <w:r>
         <w:rPr>
           <w:rFonts w:ascii="Times New Roman" w:hAnsi="Times New Roman" w:cs="Times New Roman"/>
@@ -4422,7 +4648,7 @@
           <w:color w:val="000000" w:themeColor="text1"/>
         </w:rPr>
       </w:pPr>
-      <w:bookmarkStart w:id="11" w:name="_Toc216305375"/>
+      <w:bookmarkStart w:id="11" w:name="_Toc216388718"/>
       <w:proofErr w:type="spellStart"/>
       <w:r>
         <w:rPr>
@@ -5690,7 +5916,7 @@
           <w:color w:val="000000" w:themeColor="text1"/>
         </w:rPr>
       </w:pPr>
-      <w:bookmarkStart w:id="12" w:name="_Toc216305376"/>
+      <w:bookmarkStart w:id="12" w:name="_Toc216388719"/>
       <w:proofErr w:type="spellStart"/>
       <w:r>
         <w:rPr>
@@ -5736,7 +5962,7 @@
           <w:lang w:val="es-DO"/>
         </w:rPr>
       </w:pPr>
-      <w:bookmarkStart w:id="13" w:name="_Toc216305377"/>
+      <w:bookmarkStart w:id="13" w:name="_Toc216388720"/>
       <w:proofErr w:type="spellStart"/>
       <w:r>
         <w:rPr>
@@ -5922,7 +6148,7 @@
           <w:lang w:val="es-DO"/>
         </w:rPr>
       </w:pPr>
-      <w:bookmarkStart w:id="14" w:name="_Toc216305378"/>
+      <w:bookmarkStart w:id="14" w:name="_Toc216388721"/>
       <w:r>
         <w:rPr>
           <w:rFonts w:ascii="Times New Roman" w:hAnsi="Times New Roman" w:cs="Times New Roman"/>
@@ -6008,23 +6234,202 @@
     </w:p>
     <w:p>
       <w:pPr>
-        <w:rPr>
-          <w:rFonts w:ascii="Times New Roman" w:hAnsi="Times New Roman" w:cs="Times New Roman"/>
-          <w:sz w:val="28"/>
-          <w:szCs w:val="28"/>
-          <w:lang w:val="es-DO"/>
-        </w:rPr>
-      </w:pPr>
-    </w:p>
-    <w:p>
-      <w:pPr>
-        <w:rPr>
-          <w:rFonts w:ascii="Times New Roman" w:hAnsi="Times New Roman" w:cs="Times New Roman"/>
-          <w:sz w:val="28"/>
-          <w:szCs w:val="28"/>
-          <w:lang w:val="es-DO"/>
-        </w:rPr>
-      </w:pPr>
+        <w:ind w:left="720"/>
+        <w:rPr>
+          <w:rFonts w:ascii="Times New Roman" w:hAnsi="Times New Roman" w:cs="Times New Roman"/>
+          <w:sz w:val="28"/>
+          <w:szCs w:val="28"/>
+          <w:lang w:val="es-DO"/>
+        </w:rPr>
+      </w:pPr>
+    </w:p>
+    <w:p>
+      <w:pPr>
+        <w:ind w:left="720"/>
+        <w:rPr>
+          <w:rFonts w:ascii="Times New Roman" w:hAnsi="Times New Roman" w:cs="Times New Roman"/>
+          <w:sz w:val="28"/>
+          <w:szCs w:val="28"/>
+          <w:lang w:val="es-DO"/>
+        </w:rPr>
+      </w:pPr>
+    </w:p>
+    <w:p>
+      <w:pPr>
+        <w:ind w:left="720"/>
+        <w:rPr>
+          <w:rFonts w:ascii="Times New Roman" w:hAnsi="Times New Roman" w:cs="Times New Roman"/>
+          <w:sz w:val="28"/>
+          <w:szCs w:val="28"/>
+          <w:lang w:val="es-DO"/>
+        </w:rPr>
+      </w:pPr>
+    </w:p>
+    <w:p>
+      <w:pPr>
+        <w:rPr>
+          <w:rFonts w:ascii="Times New Roman" w:hAnsi="Times New Roman" w:cs="Times New Roman"/>
+          <w:sz w:val="28"/>
+          <w:szCs w:val="28"/>
+          <w:lang w:val="es-DO"/>
+        </w:rPr>
+      </w:pPr>
+    </w:p>
+    <w:p>
+      <w:pPr>
+        <w:pStyle w:val="Heading1"/>
+        <w:rPr>
+          <w:rFonts w:ascii="Times New Roman" w:hAnsi="Times New Roman" w:cs="Times New Roman"/>
+          <w:b/>
+          <w:bCs/>
+          <w:color w:val="auto"/>
+          <w:lang w:val="es-DO"/>
+        </w:rPr>
+      </w:pPr>
+      <w:bookmarkStart w:id="15" w:name="_Toc216388722"/>
+      <w:r>
+        <w:rPr>
+          <w:rFonts w:ascii="Times New Roman" w:hAnsi="Times New Roman" w:cs="Times New Roman"/>
+          <w:b/>
+          <w:bCs/>
+          <w:color w:val="auto"/>
+          <w:lang w:val="es-DO"/>
+        </w:rPr>
+        <w:lastRenderedPageBreak/>
+        <w:t>Mantenimiento básico</w:t>
+      </w:r>
+      <w:bookmarkEnd w:id="15"/>
+    </w:p>
+    <w:p>
+      <w:pPr>
+        <w:pStyle w:val="NoSpacing"/>
+        <w:rPr>
+          <w:rFonts w:ascii="Times New Roman" w:hAnsi="Times New Roman" w:cs="Times New Roman"/>
+          <w:sz w:val="28"/>
+          <w:szCs w:val="28"/>
+          <w:lang w:val="es-DO"/>
+        </w:rPr>
+      </w:pPr>
+    </w:p>
+    <w:p>
+      <w:pPr>
+        <w:pStyle w:val="NoSpacing"/>
+        <w:ind w:left="720"/>
+        <w:rPr>
+          <w:rFonts w:ascii="Times New Roman" w:hAnsi="Times New Roman" w:cs="Times New Roman"/>
+          <w:sz w:val="28"/>
+          <w:szCs w:val="28"/>
+          <w:lang w:val="es-DO"/>
+        </w:rPr>
+      </w:pPr>
+      <w:r>
+        <w:rPr>
+          <w:rFonts w:ascii="Times New Roman" w:hAnsi="Times New Roman" w:cs="Times New Roman"/>
+          <w:b/>
+          <w:bCs/>
+          <w:sz w:val="28"/>
+          <w:szCs w:val="28"/>
+          <w:lang w:val="es-DO"/>
+        </w:rPr>
+        <w:t>Revisión.</w:t>
+      </w:r>
+      <w:r>
+        <w:rPr>
+          <w:rFonts w:ascii="Times New Roman" w:hAnsi="Times New Roman" w:cs="Times New Roman"/>
+          <w:sz w:val="28"/>
+          <w:szCs w:val="28"/>
+          <w:lang w:val="es-DO"/>
+        </w:rPr>
+        <w:t xml:space="preserve"> Asegurarse siempre que las terminales de tornillos estén bien ajustadas y que luzcan en buenas condiciones antes de conectar cualquier cosa.</w:t>
+      </w:r>
+    </w:p>
+    <w:p>
+      <w:pPr>
+        <w:pStyle w:val="NoSpacing"/>
+        <w:ind w:left="720"/>
+        <w:rPr>
+          <w:rFonts w:ascii="Times New Roman" w:hAnsi="Times New Roman" w:cs="Times New Roman"/>
+          <w:sz w:val="28"/>
+          <w:szCs w:val="28"/>
+          <w:lang w:val="es-DO"/>
+        </w:rPr>
+      </w:pPr>
+    </w:p>
+    <w:p>
+      <w:pPr>
+        <w:pStyle w:val="NoSpacing"/>
+        <w:ind w:left="720"/>
+        <w:rPr>
+          <w:rFonts w:ascii="Times New Roman" w:hAnsi="Times New Roman" w:cs="Times New Roman"/>
+          <w:sz w:val="28"/>
+          <w:szCs w:val="28"/>
+          <w:lang w:val="es-DO"/>
+        </w:rPr>
+      </w:pPr>
+      <w:r>
+        <w:rPr>
+          <w:rFonts w:ascii="Times New Roman" w:hAnsi="Times New Roman" w:cs="Times New Roman"/>
+          <w:b/>
+          <w:bCs/>
+          <w:sz w:val="28"/>
+          <w:szCs w:val="28"/>
+          <w:lang w:val="es-DO"/>
+        </w:rPr>
+        <w:t>Limpieza.</w:t>
+      </w:r>
+      <w:r>
+        <w:rPr>
+          <w:rFonts w:ascii="Times New Roman" w:hAnsi="Times New Roman" w:cs="Times New Roman"/>
+          <w:sz w:val="28"/>
+          <w:szCs w:val="28"/>
+          <w:lang w:val="es-DO"/>
+        </w:rPr>
+        <w:t xml:space="preserve"> Siempre es muy importante mantener la PCB libre de polvo y humedad. También mantener alejado de zonas muy calurosas para así evitar daños internos tanto a conexiones como a componentes.</w:t>
+      </w:r>
+    </w:p>
+    <w:p>
+      <w:pPr>
+        <w:pStyle w:val="NoSpacing"/>
+        <w:ind w:left="720"/>
+        <w:rPr>
+          <w:rFonts w:ascii="Times New Roman" w:hAnsi="Times New Roman" w:cs="Times New Roman"/>
+          <w:sz w:val="28"/>
+          <w:szCs w:val="28"/>
+          <w:lang w:val="es-DO"/>
+        </w:rPr>
+      </w:pPr>
+    </w:p>
+    <w:p>
+      <w:pPr>
+        <w:pStyle w:val="NoSpacing"/>
+        <w:ind w:left="720"/>
+        <w:rPr>
+          <w:rFonts w:ascii="Times New Roman" w:hAnsi="Times New Roman" w:cs="Times New Roman"/>
+          <w:sz w:val="28"/>
+          <w:szCs w:val="28"/>
+          <w:lang w:val="es-DO"/>
+        </w:rPr>
+      </w:pPr>
+      <w:r>
+        <w:rPr>
+          <w:rFonts w:ascii="Times New Roman" w:hAnsi="Times New Roman" w:cs="Times New Roman"/>
+          <w:b/>
+          <w:bCs/>
+          <w:sz w:val="28"/>
+          <w:szCs w:val="28"/>
+          <w:lang w:val="es-DO"/>
+        </w:rPr>
+        <w:t>Seguridad.</w:t>
+      </w:r>
+      <w:r>
+        <w:rPr>
+          <w:rFonts w:ascii="Times New Roman" w:hAnsi="Times New Roman" w:cs="Times New Roman"/>
+          <w:sz w:val="28"/>
+          <w:szCs w:val="28"/>
+          <w:lang w:val="es-DO"/>
+        </w:rPr>
+        <w:t xml:space="preserve"> Desconectar siempre la alimentación a 24V antes de mover o hacer algún tipo de ajuste en alguna entrada o salida.</w:t>
+      </w:r>
     </w:p>
     <w:p>
       <w:pPr>
@@ -6058,6 +6463,7 @@
           <w:lang w:val="es-DO"/>
         </w:rPr>
       </w:pPr>
+      <w:bookmarkStart w:id="16" w:name="_Toc216388723"/>
       <w:r>
         <w:rPr>
           <w:rFonts w:ascii="Times New Roman" w:hAnsi="Times New Roman" w:cs="Times New Roman"/>
@@ -6066,9 +6472,9 @@
           <w:color w:val="000000" w:themeColor="text1"/>
           <w:lang w:val="es-DO"/>
         </w:rPr>
-        <w:lastRenderedPageBreak/>
         <w:t>Bibliografías</w:t>
       </w:r>
+      <w:bookmarkEnd w:id="16"/>
     </w:p>
     <w:p>
       <w:pPr>
@@ -6182,34 +6588,57 @@
           <w:bCs/>
           <w:sz w:val="28"/>
           <w:szCs w:val="28"/>
-        </w:rPr>
-      </w:pPr>
-      <w:r>
-        <w:rPr>
-          <w:rFonts w:ascii="Times New Roman" w:hAnsi="Times New Roman" w:cs="Times New Roman"/>
-          <w:b/>
-          <w:bCs/>
-          <w:sz w:val="28"/>
-          <w:szCs w:val="28"/>
-        </w:rPr>
-        <w:t>ESP32 Datasheet</w:t>
-      </w:r>
+          <w:lang w:val="es-DO"/>
+        </w:rPr>
+      </w:pPr>
+      <w:r>
+        <w:rPr>
+          <w:rFonts w:ascii="Times New Roman" w:hAnsi="Times New Roman" w:cs="Times New Roman"/>
+          <w:b/>
+          <w:bCs/>
+          <w:sz w:val="28"/>
+          <w:szCs w:val="28"/>
+          <w:lang w:val="es-DO"/>
+        </w:rPr>
+        <w:t xml:space="preserve">ESP32 </w:t>
+      </w:r>
+      <w:proofErr w:type="spellStart"/>
+      <w:r>
+        <w:rPr>
+          <w:rFonts w:ascii="Times New Roman" w:hAnsi="Times New Roman" w:cs="Times New Roman"/>
+          <w:b/>
+          <w:bCs/>
+          <w:sz w:val="28"/>
+          <w:szCs w:val="28"/>
+          <w:lang w:val="es-DO"/>
+        </w:rPr>
+        <w:t>Datasheet</w:t>
+      </w:r>
+      <w:proofErr w:type="spellEnd"/>
     </w:p>
     <w:p>
       <w:pPr>
         <w:pStyle w:val="NoSpacing"/>
         <w:rPr>
           <w:rFonts w:ascii="Times New Roman" w:hAnsi="Times New Roman" w:cs="Times New Roman"/>
-        </w:rPr>
-      </w:pPr>
-      <w:r>
-        <w:rPr>
-          <w:rFonts w:ascii="Times New Roman" w:hAnsi="Times New Roman" w:cs="Times New Roman"/>
+          <w:lang w:val="es-DO"/>
+        </w:rPr>
+      </w:pPr>
+      <w:r>
+        <w:rPr>
+          <w:rFonts w:ascii="Times New Roman" w:hAnsi="Times New Roman" w:cs="Times New Roman"/>
+          <w:lang w:val="es-DO"/>
         </w:rPr>
         <w:t>https://www.alldatasheet.com/view.jsp?Searchword=Esp-wroom-32%20datasheet&amp;gad_source=1&amp;gad_campaignid=1820008784&amp;gbraid=0AAAAADcdDU9SfFFjmNKBDGL_yLSfRD9aA&amp;gclid=CjwKCAiA0eTJBhBaEiwA-Pa-hWJEgH3L90ZHY5A0rq5n0q5OOSVnPqtojZlt09uZGAaFfLSzRkDE0xoCS3sQAvD_BwE</w:t>
       </w:r>
     </w:p>
-    <w:p/>
+    <w:p>
+      <w:pPr>
+        <w:rPr>
+          <w:lang w:val="es-DO"/>
+        </w:rPr>
+      </w:pPr>
+    </w:p>
     <w:sectPr>
       <w:pgSz w:w="12240" w:h="15840"/>
       <w:pgMar w:top="1440" w:right="1440" w:bottom="1440" w:left="1440" w:header="720" w:footer="720" w:gutter="0"/>
@@ -7225,6 +7654,7 @@
   <w:style w:type="character" w:default="1" w:styleId="DefaultParagraphFont">
     <w:name w:val="Default Paragraph Font"/>
     <w:uiPriority w:val="1"/>
+    <w:semiHidden/>
     <w:unhideWhenUsed/>
   </w:style>
   <w:style w:type="table" w:default="1" w:styleId="TableNormal">

</xml_diff>